<commit_message>
proyecto de la api de wilson ya estriminado utilizando mysql para poder ver los datos de la tabla y laragon como bace de datos no sql
</commit_message>
<xml_diff>
--- a/word/usabilidad_api_gastronomia.docx
+++ b/word/usabilidad_api_gastronomia.docx
@@ -2180,13 +2180,13 @@
         <w:tab/>
       </w:r>
       <w:r>
-        <w:t xml:space="preserve">Encienda las bases de datos: doble clic en </w:t>
-      </w:r>
-      <w:r>
-        <w:rPr>
-          <w:rStyle w:val="CodigoEnLinea"/>
-        </w:rPr>
-        <w:t xml:space="preserve">C:\Users\BURBANO\bd_gastronomia_local\iniciar_bases.bat</w:t>
+        <w:t xml:space="preserve">Encienda las bases de datos: abra Docker Desktop y, en una terminal abierta en la carpeta api_gastronomia, escriba </w:t>
+      </w:r>
+      <w:r>
+        <w:rPr>
+          <w:rStyle w:val="CodigoEnLinea"/>
+        </w:rPr>
+        <w:t xml:space="preserve">docker compose up -d</w:t>
       </w:r>
     </w:p>
     <w:p>
@@ -2209,7 +2209,7 @@
         <w:keepNext/>
       </w:pPr>
       <w:r>
-        <w:t xml:space="preserve">cd "C:\Users\BURBANO\Desktop\TRABAJOS\Miercoles\istructivo mongo db\api_gastronomia"</w:t>
+        <w:t xml:space="preserve">cd "C:\Users\SENA\Desktop\BURBANO\miercoles\api_gastronomia"</w:t>
       </w:r>
     </w:p>
     <w:p>
@@ -6200,7 +6200,7 @@
         <w:keepNext/>
       </w:pPr>
       <w:r>
-        <w:t xml:space="preserve">  "password": "ADMIN_1234"</w:t>
+        <w:t xml:space="preserve">  "password": "Admin123*"</w:t>
       </w:r>
     </w:p>
     <w:p>

</xml_diff>